<commit_message>
Fix: add missing Vysnovky section to Lab5 docx report
</commit_message>
<xml_diff>
--- a/ЛР5/Lab5_Report.docx
+++ b/ЛР5/Lab5_Report.docx
@@ -1993,6 +1993,51 @@
           <w:sz w:val="24"/>
         </w:rPr>
         <w:t>Рисунок 4 – DBSCAN з PCA (eps=0.6, min_samples=4)</w:t>
+      </w:r>
+    </w:p>
+    <w:p>
+      <w:pPr>
+        <w:spacing w:before="240" w:after="120"/>
+        <w:ind w:firstLine="0"/>
+        <w:jc w:val="center"/>
+      </w:pPr>
+      <w:r>
+        <w:rPr>
+          <w:rFonts w:ascii="Times New Roman" w:hAnsi="Times New Roman"/>
+          <w:b/>
+          <w:sz w:val="28"/>
+        </w:rPr>
+        <w:t>5. Висновки</w:t>
+      </w:r>
+    </w:p>
+    <w:p>
+      <w:r>
+        <w:t>У ході лабораторної роботи було досліджено чотири різних методи навчання без вчителя на датасеті Ірисів Фішера (150 зразків, 4 ознаки, 3 класи).</w:t>
+      </w:r>
+    </w:p>
+    <w:p>
+      <w:r>
+        <w:t>1. K-means показав найкращі результати на парі ознак пелюстки (Petal length / Petal width), де кластери мають майже сферичну форму. Алгоритм працює швидко, але потребує заздалегідь вказати кількість кластерів k та чутливий до викидів.</w:t>
+      </w:r>
+    </w:p>
+    <w:p>
+      <w:r>
+        <w:t>2. Ієрархічна кластеризація (метод Ward) побудувала дендрограму, яка наочно демонструє послідовне об'єднання точок у кластери. Цей метод не потребує знання k наперед, але має обчислювальну складність O(n³), що робить його непридатним для великих датасетів.</w:t>
+      </w:r>
+    </w:p>
+    <w:p>
+      <w:r>
+        <w:t>3. t-SNE дозволив візуалізувати 4-вимірні дані у 3D просторі зі збереженням локальних відстаней. Три класи ірисів чітко розділяються у тривимірному просторі, що підтверджує наявність трьох різних підмножин у даних.</w:t>
+      </w:r>
+    </w:p>
+    <w:p>
+      <w:r>
+        <w:t>4. DBSCAN з PCA ефективно виявив кластери довільної форми та автоматично позначив аномальні точки як шум (Outliers). Підбір гіперпараметрів eps та min_samples є критичним для якості кластеризації.</w:t>
+      </w:r>
+    </w:p>
+    <w:p>
+      <w:r>
+        <w:t>Загалом, кожен метод має свої сильні та слабкі сторони, і вибір конкретного алгоритму залежить від характеру даних, їх обсягу та вимог до інтерпретованості результатів.</w:t>
       </w:r>
     </w:p>
     <w:sectPr>

</xml_diff>